<commit_message>
Session 1: remove handout-dependent activities, strip facilitator notes from slides
Removed (required printed worksheets/cards):
- Observer Round (required printed observation worksheet)
- Settings Gallery (required pre-printed setting cards)
- Design Decision Cards (required printed fill-in cards)
- Sort the Examples (required DIGITISED/DIGITAL cards per person)

Rewritten to use generic materials (phones, sticky notes, whiteboard):
- Sticky Note Audit (replaces Settings Gallery)
- Digital or Digitised? (Mentimeter poll, replaces card sort)
- Commitment Partner (phone reminder instead of printed card)
- The Gap (Mentimeter instead of folded paper)

Slides now only show participant-facing content. Facilitator notes
moved to the .docx guide and to a collapsible 'Facilitator notes'
section on the web page.

Activity count: 27 → 25

Co-Authored-By: Claude Opus 4.6 <noreply@anthropic.com>
</commit_message>
<xml_diff>
--- a/assets/downloads/Session-1-What-Is-Digital-Youth-Work-Facilitator-Guide.docx
+++ b/assets/downloads/Session-1-What-Is-Digital-Youth-Work-Facilitator-Guide.docx
@@ -288,7 +288,7 @@
           </w:tcPr>
           <w:p>
             <w:r>
-              <w:t>8 activities — pick what fits your group</w:t>
+              <w:t>6 activities — pick what fits your group</w:t>
             </w:r>
           </w:p>
         </w:tc>
@@ -507,7 +507,7 @@
     </w:p>
     <w:p>
       <w:r>
-        <w:t>Facilitator reads 4 statements. Participants move to the Yes, No, or Maybe corner of the room. Keep it quick — don't debate, just move.</w:t>
+        <w:t>Four statements will be read out. Move to the Yes, No, or Maybe corner of the room for each. Keep it quick — don't debate, just move.</w:t>
       </w:r>
     </w:p>
     <w:p>
@@ -601,11 +601,12 @@
       </w:r>
     </w:p>
     <w:p>
-      <w:pPr>
-        <w:pStyle w:val="ListBullet"/>
-      </w:pPr>
       <w:r>
-        <w:t>Facilitator runs a 10-question Kahoot (topic: general knowledge or fun)</w:t>
+        <w:rPr>
+          <w:b/>
+          <w:color w:val="7B61FF"/>
+        </w:rPr>
+        <w:t>Facilitator notes:</w:t>
       </w:r>
     </w:p>
     <w:p>
@@ -613,7 +614,7 @@
         <w:pStyle w:val="ListBullet"/>
       </w:pPr>
       <w:r>
-        <w:t>Participants play on their phones as if they were young people</w:t>
+        <w:t>Pre-build a 10-question Kahoot on a fun topic (general knowledge, pop culture)</w:t>
       </w:r>
     </w:p>
     <w:p>
@@ -621,22 +622,15 @@
         <w:pStyle w:val="ListBullet"/>
       </w:pPr>
       <w:r>
-        <w:t>No talking — just play the game as it comes</w:t>
-      </w:r>
-    </w:p>
-    <w:p/>
-    <w:p>
-      <w:r>
-        <w:rPr>
-          <w:b/>
-          <w:sz w:val="24"/>
-        </w:rPr>
-        <w:t>▶  Observer Round</w:t>
+        <w:t>Keep all default settings — timer on, music on, leaderboard visible</w:t>
       </w:r>
     </w:p>
     <w:p>
+      <w:pPr>
+        <w:pStyle w:val="ListBullet"/>
+      </w:pPr>
       <w:r>
-        <w:t>Half the group plays a shorter quiz (5 questions) while the other half silently watches. Observers use a worksheet: Who looks stressed? Who lights up? Who disengages? Who's first to answer? Who checks their phone between questions?</w:t>
+        <w:t>Don't explain the rules — let them experience confusion if it happens</w:t>
       </w:r>
     </w:p>
     <w:p/>
@@ -651,7 +645,16 @@
     </w:p>
     <w:p>
       <w:r>
-        <w:t>Debrief the experience before changing anything.</w:t>
+        <w:t>Sticky notes in two columns on the board: one thing that felt good, one thing that felt bad. Quick show of hands: who felt competitive? Who felt stressed? Who checked out?</w:t>
+      </w:r>
+    </w:p>
+    <w:p>
+      <w:r>
+        <w:rPr>
+          <w:b/>
+          <w:color w:val="7B61FF"/>
+        </w:rPr>
+        <w:t>Facilitator notes:</w:t>
       </w:r>
     </w:p>
     <w:p>
@@ -659,7 +662,7 @@
         <w:pStyle w:val="ListBullet"/>
       </w:pPr>
       <w:r>
-        <w:t>Show of hands: Who felt competitive? Who felt stressed? Who stopped caring?</w:t>
+        <w:t>Don't jump to analysis — let the room name the feelings first</w:t>
       </w:r>
     </w:p>
     <w:p>
@@ -667,23 +670,7 @@
         <w:pStyle w:val="ListBullet"/>
       </w:pPr>
       <w:r>
-        <w:t>On sticky notes: one thing that felt good, one thing that felt bad</w:t>
-      </w:r>
-    </w:p>
-    <w:p>
-      <w:pPr>
-        <w:pStyle w:val="ListBullet"/>
-      </w:pPr>
-      <w:r>
-        <w:t>Stick them on the board in two columns. Read a few out.</w:t>
-      </w:r>
-    </w:p>
-    <w:p>
-      <w:pPr>
-        <w:pStyle w:val="ListBullet"/>
-      </w:pPr>
-      <w:r>
-        <w:t>Observers share what they saw — not what players said, what they saw</w:t>
+        <w:t>If someone says 'I loved the pressure', ask: would every young person love it?</w:t>
       </w:r>
     </w:p>
     <w:p/>
@@ -707,7 +694,16 @@
     </w:p>
     <w:p>
       <w:r>
-        <w:t>In pairs, pick ONE setting to change and re-run part of the quiz.</w:t>
+        <w:t>In pairs, pick ONE setting to change and re-run part of the quiz. Options: remove the timer / hide the leaderboard / enable anonymous answers / team mode / remove the music.</w:t>
+      </w:r>
+    </w:p>
+    <w:p>
+      <w:r>
+        <w:rPr>
+          <w:b/>
+          <w:color w:val="7B61FF"/>
+        </w:rPr>
+        <w:t>Facilitator notes:</w:t>
       </w:r>
     </w:p>
     <w:p>
@@ -715,7 +711,7 @@
         <w:pStyle w:val="ListBullet"/>
       </w:pPr>
       <w:r>
-        <w:t>Options: remove the timer / hide the leaderboard / enable anonymous answers / team mode / remove the music</w:t>
+        <w:t>Build a shorter 5-question quiz each pair can trigger with the chosen change</w:t>
       </w:r>
     </w:p>
     <w:p>
@@ -723,15 +719,7 @@
         <w:pStyle w:val="ListBullet"/>
       </w:pPr>
       <w:r>
-        <w:t>Facilitator sets up a shorter quiz with the change</w:t>
-      </w:r>
-    </w:p>
-    <w:p>
-      <w:pPr>
-        <w:pStyle w:val="ListBullet"/>
-      </w:pPr>
-      <w:r>
-        <w:t>Re-run. What's different? Is it better or worse? For who?</w:t>
+        <w:t>Rotate pairs through the modified version quickly — 2–3 minutes each</w:t>
       </w:r>
     </w:p>
     <w:p/>
@@ -755,7 +743,7 @@
     </w:p>
     <w:p>
       <w:r>
-        <w:t>Re-run with anonymous nicknames (no real names on the leaderboard). Does anything shift? Who contributes now who didn't before? Who goes quieter? Note it down.</w:t>
+        <w:t>Re-run the quiz with anonymous nicknames (no real names on the leaderboard). Who contributes now who didn't before? Who goes quieter? Share what you noticed.</w:t>
       </w:r>
     </w:p>
     <w:p/>
@@ -765,27 +753,12 @@
           <w:b/>
           <w:sz w:val="24"/>
         </w:rPr>
-        <w:t>▶  Settings Gallery</w:t>
+        <w:t>▶  Sticky Note Audit</w:t>
       </w:r>
     </w:p>
     <w:p>
       <w:r>
-        <w:t>Pin a card on the wall for each Kahoot setting (timer, leaderboard, music, team mode, anonymous, chat, skip-allowed). In pairs, walk round and add a sticky note to each: 'What this changes for the young person.' Read the wall as a group.</w:t>
-      </w:r>
-    </w:p>
-    <w:p/>
-    <w:p>
-      <w:r>
-        <w:rPr>
-          <w:b/>
-          <w:sz w:val="24"/>
-        </w:rPr>
-        <w:t>▶  Design Decision Cards</w:t>
-      </w:r>
-    </w:p>
-    <w:p>
-      <w:r>
-        <w:t>Each pair fills in a card: 'We changed ___ because ___. The effect was ___. For a young person who ___ this would mean ___.' Share back to the group.</w:t>
+        <w:t>On the whiteboard, write each Kahoot setting across the top (timer, leaderboard, music, team mode, anonymous). In pairs, walk up and add a sticky note under each one: 'What this changes for a young person.' Read the wall aloud as a group.</w:t>
       </w:r>
     </w:p>
     <w:p/>
@@ -809,7 +782,7 @@
     </w:p>
     <w:p>
       <w:r>
-        <w:t>Observers now play; players now observe. Different setting changed. Observers: what do you notice now that you missed when you were playing? Players: what's different knowing someone is watching?</w:t>
+        <w:t>Swap roles — the loud ones step back, the quiet ones lead. Change a different setting. What shifts? What's different when the dynamic changes, not just the tool?</w:t>
       </w:r>
     </w:p>
     <w:p/>
@@ -869,12 +842,21 @@
           <w:b/>
           <w:sz w:val="24"/>
         </w:rPr>
-        <w:t>▶  Sort the Examples</w:t>
+        <w:t>▶  Digital or Digitised?</w:t>
       </w:r>
     </w:p>
     <w:p>
       <w:r>
-        <w:t>Facilitator reads out 8 examples. Participants hold up a card: 'DIGITISED' or 'DIGITAL'. Discuss any disagreements.</w:t>
+        <w:rPr>
+          <w:color w:val="E91E8C"/>
+          <w:sz w:val="20"/>
+        </w:rPr>
+        <w:t>Tool: Mentimeter</w:t>
+      </w:r>
+    </w:p>
+    <w:p>
+      <w:r>
+        <w:t>8 examples appear on screen one at a time. Vote live: DIGITAL or DIGITISED. See the split. Where the room disagrees, that's the conversation.</w:t>
       </w:r>
     </w:p>
     <w:p>
@@ -949,6 +931,31 @@
         <w:t>An Instagram poll asking young people to vote on next week's activity → DIGITAL</w:t>
       </w:r>
     </w:p>
+    <w:p>
+      <w:r>
+        <w:rPr>
+          <w:b/>
+          <w:color w:val="7B61FF"/>
+        </w:rPr>
+        <w:t>Facilitator notes:</w:t>
+      </w:r>
+    </w:p>
+    <w:p>
+      <w:pPr>
+        <w:pStyle w:val="ListBullet"/>
+      </w:pPr>
+      <w:r>
+        <w:t>Set up a Mentimeter multiple-choice poll per example</w:t>
+      </w:r>
+    </w:p>
+    <w:p>
+      <w:pPr>
+        <w:pStyle w:val="ListBullet"/>
+      </w:pPr>
+      <w:r>
+        <w:t>Reveal the 'answer' only after the vote — don't lead the room</w:t>
+      </w:r>
+    </w:p>
     <w:p/>
     <w:p>
       <w:r>
@@ -961,7 +968,7 @@
     </w:p>
     <w:p>
       <w:r>
-        <w:t>Two boards on the wall: DIGITISED and DIGITAL. Everyone takes one activity they currently run and sticks it on whichever board it fits. Be honest — if it's digitised paper, that's fine, just name it. Walk the wall.</w:t>
+        <w:t>Two columns on the whiteboard: DIGITISED and DIGITAL. On a sticky note, write one activity you currently run and stick it under the column it fits. Be honest — digitised paper is fine, just name it. Walk the wall.</w:t>
       </w:r>
     </w:p>
     <w:p/>
@@ -976,7 +983,7 @@
     </w:p>
     <w:p>
       <w:r>
-        <w:t>Facilitator shows a setting (leaderboard, timer, chat disabled, anonymous mode). In pairs, write down what value that setting expresses. Compare answers across the room. Same setting, different values? That's the conversation.</w:t>
+        <w:t>One setting projected on screen (leaderboard, timer, chat off, anonymous). In pairs, write on a sticky note the value that setting expresses. Compare. Same setting, different values? That's the conversation.</w:t>
       </w:r>
     </w:p>
     <w:p/>
@@ -991,7 +998,7 @@
     </w:p>
     <w:p>
       <w:r>
-        <w:t>Facilitator projects a screenshot of a Kahoot setup screen. Each pair writes one question they'd ask the person who set it up about why they made each choice. Read a few aloud — you've just written your own facilitator audit.</w:t>
+        <w:t>A screenshot of a Kahoot setup screen is projected. In pairs, write one question you'd ask the person who set it up. Read a few aloud — you've just written your own facilitator audit.</w:t>
       </w:r>
     </w:p>
     <w:p/>
@@ -1190,7 +1197,7 @@
     </w:p>
     <w:p>
       <w:r>
-        <w:t>Partner with someone NOT from your organisation. Swap contact details. Agree one thing you'll each try and check in in 2 weeks. Write it on a card and keep it.</w:t>
+        <w:t>Partner with someone NOT from your organisation. Swap phone numbers. Agree one thing you'll each try and check in in 2 weeks. Put a reminder on your phone now.</w:t>
       </w:r>
     </w:p>
     <w:p/>
@@ -1205,7 +1212,16 @@
     </w:p>
     <w:p>
       <w:r>
-        <w:t>On a paper: 'One thing I knew before this session. One thing I know now. One thing I still don't know.' Fold it. Hand it to the facilitator on the way out.</w:t>
+        <w:rPr>
+          <w:color w:val="E91E8C"/>
+          <w:sz w:val="20"/>
+        </w:rPr>
+        <w:t>Tool: Mentimeter</w:t>
+      </w:r>
+    </w:p>
+    <w:p>
+      <w:r>
+        <w:t>Three quick prompts on screen: 'One thing I knew before. One thing I know now. One thing I still don't know.' Submit live. Read a few aloud.</w:t>
       </w:r>
     </w:p>
     <w:p/>

</xml_diff>

<commit_message>
Update session opening questions per curriculum update
S1: 'What happens when young people engage in digital spaces?'
S2: 'What are the hidden and explicit values of the digital youth work curriculum?'
S3: 'What is harm in digital spaces — and where does it show up, online and in-person?'
S6: 'What does good digital youth work look like?' (drop 'actually')

Co-Authored-By: Claude Opus 4.6 <noreply@anthropic.com>
</commit_message>
<xml_diff>
--- a/assets/downloads/Session-1-What-Is-Digital-Youth-Work-Facilitator-Guide.docx
+++ b/assets/downloads/Session-1-What-Is-Digital-Youth-Work-Facilitator-Guide.docx
@@ -427,7 +427,7 @@
           <w:color w:val="00A6AD"/>
           <w:sz w:val="26"/>
         </w:rPr>
-        <w:t>"How does youth work change when young people are online?"</w:t>
+        <w:t>"What happens when young people engage in digital spaces?"</w:t>
       </w:r>
     </w:p>
     <w:p>
@@ -438,7 +438,7 @@
         <w:t xml:space="preserve">What this means: </w:t>
       </w:r>
       <w:r>
-        <w:t>This isn't about technology. It's about whether the things you already do as a youth worker — building trust, giving young people a voice, keeping them safe — work the same way on a screen.</w:t>
+        <w:t>Young people live, play, argue, hide, perform and grow in digital spaces. Youth work doesn't pause at the screen — it follows them there. This session is about what that actually looks like, and what changes about the work when it does.</w:t>
       </w:r>
     </w:p>
     <w:p/>

</xml_diff>